<commit_message>
chore(aid): docx v2 → v1
Co-Authored-By: Claude Opus 4.6 (1M context) <noreply@anthropic.com>
</commit_message>
<xml_diff>
--- a/ECRITS_NIYYAH/aid_module.docx
+++ b/ECRITS_NIYYAH/aid_module.docx
@@ -119,7 +119,7 @@
           <w:sz w:val="22"/>
           <w:szCs w:val="22"/>
         </w:rPr>
-        <w:t xml:space="preserve">2. 9 Dhûl-Hijja — Yawm Arafat: C'est le jour le plus important du Hajj. Tous les pèlerins sont au mont Arafat, vêtus de blanc, du matin au coucher du soleil. Ils invoquent Allâh à voix haute. Le Prophète ﷺ a dit : 'Le meilleur des du'âs est celui du jour d'Arafat.' Pour ceux qui ne font pas le Hajj, jeûner ce jour-là efface les péchés de l'année précédente et de l'année qui vient (Muslim).</w:t>
+        <w:t xml:space="preserve">2. 9 Dhûl-Hijja — Yawm Arafat: C'est le jour le plus important du Hajj. Tous les pèlerins sont au mont Arafat, vêtus de blanc, du matin au coucher du soleil. Ils invoquent Allâh à voix haute. Le Prophète ﷺ a dit : 'Le meilleur des du'âs est celui du jour d'Arafat.' Pour ceux qui ne font pas le Hajj, le Prophète ﷺ a espéré qu'Allâh efface par ce jeûne les péchés de l'année précédente et de l'année qui vient (Muslim 1162).</w:t>
       </w:r>
     </w:p>
     <w:p>
@@ -331,7 +331,7 @@
           <w:sz w:val="22"/>
           <w:szCs w:val="22"/>
         </w:rPr>
-        <w:t xml:space="preserve">1. Pourquoi sacrifier ?: Le Qurbani ne nourrit pas Allâh — Il n'a besoin de rien. Allâh dit dans le Coran : 'Ni leurs chairs ni leur sang n'atteignent Allâh. Ce qui L'atteint, c'est votre piété.' (Hajj 22:37). Tu sacrifies pour PROUVER quelque chose à toi-même : tu peux te détacher de ce que tu aimes pour Lui.</w:t>
+        <w:t xml:space="preserve">1. Pourquoi sacrifier ?: Le Qurbani ne nourrit pas Allâh — Il n'a besoin de rien. Allâh dit dans le Coran : 'Ni leurs chairs ni leur sang n'atteignent Allâh. Ce qui L'atteint, c'est votre piété.' (Hajj 22:37). Tu sacrifies pour RÉVÉLER quelque chose en toi-même : tu peux te détacher de ce que tu aimes pour Lui.</w:t>
       </w:r>
     </w:p>
     <w:p>
@@ -757,7 +757,7 @@
           <w:sz w:val="22"/>
           <w:szCs w:val="22"/>
         </w:rPr>
-        <w:t xml:space="preserve">7. aid_adha_med_007: Tu as fait des sacrifices cette année. Des choses tues. Des envies refoulées. Des relations rompues pour Allâh. Aujourd'hui, Allâh les regarde comme Il a regardé Ibrâhîm. Ton couteau aussi a été suspendu.</w:t>
+        <w:t xml:space="preserve">7. aid_adha_med_007: Tu as fait des sacrifices cette année. Des choses tues. Des envies refoulées. Des relations rompues pour Allâh. Aujourd'hui, Allâh voit tes sacrifices comme Il voyait ceux d'Ibrâhîm. Ton couteau aussi a été suspendu.</w:t>
       </w:r>
     </w:p>
     <w:p>
@@ -829,7 +829,7 @@
           <w:sz w:val="22"/>
           <w:szCs w:val="22"/>
         </w:rPr>
-        <w:t xml:space="preserve">13. aid_adha_med_013: Le sacrifice d'Ibrâhîm n'était pas pour Allâh. Allâh n'a besoin de rien. C'était pour Ibrâhîm. Pour qu'il SACHE qu'il pouvait. Tu peux aussi. Tu ne le sauras qu'en essayant.</w:t>
+        <w:t xml:space="preserve">13. aid_adha_med_013: Le sacrifice d'Ibrâhîm n'était pas pour Allâh. Allâh n'a besoin de rien. C'était une révélation à Ibrâhîm de sa propre disposition. Tu peux aussi te révéler à toi-même.</w:t>
       </w:r>
     </w:p>
     <w:p>

</xml_diff>

<commit_message>
fix(aid): erreurs hadith audit v2
Co-Authored-By: Claude Opus 4.6 (1M context) <noreply@anthropic.com>
</commit_message>
<xml_diff>
--- a/ECRITS_NIYYAH/aid_module.docx
+++ b/ECRITS_NIYYAH/aid_module.docx
@@ -4962,7 +4962,7 @@
           <w:sz w:val="22"/>
           <w:szCs w:val="22"/>
         </w:rPr>
-        <w:t xml:space="preserve">La Zakât al-Fitr n'est PAS une option. C'est une obligation pour chaque musulman. Si tu l'as oubliée, donne-la aujourd'hui même comme aumône. Allâh accepte le repentir tant que le soleil ne s'est pas couché à l'Ouest.</w:t>
+        <w:t xml:space="preserve">La Zakât al-Fitr n'est PAS une option. C'est une obligation pour chaque musulman. Si tu l'as oubliée, donne-la aujourd'hui même comme aumône. Allâh accepte le repentir tant que le soleil ne s'est pas levé à l'Ouest.</w:t>
       </w:r>
     </w:p>
     <w:p>
@@ -5046,7 +5046,7 @@
           <w:sz w:val="22"/>
           <w:szCs w:val="22"/>
         </w:rPr>
-        <w:t xml:space="preserve">Aujourd'hui est interdit le jeûne. Allâh a INTERDIT de jeûner le jour de l'Aïd al-Fitr (Bukhari). Pour une fois, manger est une obéissance. Profite sans culpabilité. C'est la fête.</w:t>
+        <w:t xml:space="preserve">Aujourd'hui est interdit le jeûne. Le Prophète ﷺ a interdit le jeûne des deux jours d'Aïd — Fitr et Adha (Bukhari). Pour une fois, manger est une obéissance. Profite sans culpabilité. C'est la fête.</w:t>
       </w:r>
     </w:p>
     <w:p>
@@ -5920,7 +5920,7 @@
           <w:sz w:val="22"/>
           <w:szCs w:val="22"/>
         </w:rPr>
-        <w:t xml:space="preserve">À Arafat, Allâh est plus proche que d'habitude. Il dit aux anges : 'Regardez Mes serviteurs venus à Moi en pleureurs et poussiéreux. Que veulent-ils ?' (hadith authentique, Muslim). Allâh se vante de toi devant les anges aujourd'hui.</w:t>
+        <w:t xml:space="preserve">À Arafat, Allâh est plus proche que d'habitude. Il dit aux anges : 'Regardez Mes serviteurs venus à Moi en pleureurs et poussiéreux. Que veulent-ils ?' (hadith authentique, Muslim). Allâh se vante des pèlerins d'Arafat devant Ses anges aujourd'hui.</w:t>
       </w:r>
     </w:p>
     <w:p>
@@ -6425,7 +6425,7 @@
           <w:sz w:val="22"/>
           <w:szCs w:val="22"/>
         </w:rPr>
-        <w:t xml:space="preserve">Pour se distinguer des juifs qui jeûnaient aussi ce jour, le Prophète ﷺ a recommandé de jeûner le 9 ET le 10 (ou le 10 et le 11). Tâsû'â et Ashûrâ ensemble.</w:t>
+        <w:t xml:space="preserve">Pour se distinguer des juifs qui jeûnaient aussi ce jour, le Prophète ﷺ a recommandé de jeûner le 9 ET le 10 (Muslim). Tâsû'â et Ashûrâ ensemble.</w:t>
       </w:r>
     </w:p>
     <w:p>

</xml_diff>

<commit_message>
fix(aid): fiqh qurbani + zakat al-fitr audit v3
Co-Authored-By: Claude Opus 4.6 (1M context) <noreply@anthropic.com>
</commit_message>
<xml_diff>
--- a/ECRITS_NIYYAH/aid_module.docx
+++ b/ECRITS_NIYYAH/aid_module.docx
@@ -1548,7 +1548,7 @@
           <w:sz w:val="22"/>
           <w:szCs w:val="22"/>
         </w:rPr>
-        <w:t xml:space="preserve">Le sacrifice n'est PAS obligatoire pour celui qui n'a pas les moyens. C'est une sunna recommandée, pas un pilier. Si tu ne peux pas, tu n'as pas péché. Donne une aumône à la mesure de tes moyens. Allâh accepte.</w:t>
+        <w:t xml:space="preserve">Le sacrifice n'est PAS obligatoire pour celui qui n'a pas les moyens. C'est une sunna fortement recommandée selon la majorité ; les hanafîs la considèrent obligatoire pour qui en a les moyens. Si tu ne peux pas, tu n'as pas péché. Donne une aumône à la mesure de tes moyens. Allâh accepte.</w:t>
       </w:r>
     </w:p>
     <w:p>
@@ -5318,7 +5318,7 @@
           <w:sz w:val="22"/>
           <w:szCs w:val="22"/>
         </w:rPr>
-        <w:t xml:space="preserve">La Zakât al-Fitr est une aumône obligatoire pour TOUS les musulmans — homme, femme, enfant, libre, esclave. Le chef de famille la donne pour chaque membre de son foyer. Le Prophète ﷺ l'a ordonnée pour 'purifier le jeûneur des paroles vaines et indécentes, et pour nourrir les pauvres.' (Abû Dâwûd).</w:t>
+        <w:t xml:space="preserve">La Zakât al-Fitr est une aumône obligatoire pour tout musulman qui en a les moyens au coucher du soleil du dernier jour de Ramadan. Le chef de famille la donne pour chaque membre de son foyer. Le Prophète ﷺ l'a ordonnée pour 'purifier le jeûneur des paroles vaines et indécentes, et pour nourrir les pauvres.' (Abû Dâwûd).</w:t>
       </w:r>
     </w:p>
     <w:p>

</xml_diff>

<commit_message>
fix(aid): reformulations aqîda audit v2
Co-Authored-By: Claude Opus 4.6 (1M context) <noreply@anthropic.com>
</commit_message>
<xml_diff>
--- a/ECRITS_NIYYAH/aid_module.docx
+++ b/ECRITS_NIYYAH/aid_module.docx
@@ -1440,7 +1440,7 @@
           <w:sz w:val="22"/>
           <w:szCs w:val="22"/>
         </w:rPr>
-        <w:t xml:space="preserve">Le Prophète ﷺ sacrifiait préférentiellement un bélier blanc avec des taches noires (Bukhari). Le bélier symbolise la docilité — l'animal qui ne résiste pas. C'est aussi ce qu'Allâh aime en toi : la soumission douce, pas le combat.</w:t>
+        <w:t xml:space="preserve">Le Prophète ﷺ sacrifiait préférentiellement un bélier blanc avec des taches noires (Bukhari). Le choix du bélier suit la sunna du Prophète ﷺ. Certains savants y voient un rappel de la soumission au décret divin.</w:t>
       </w:r>
     </w:p>
     <w:p>
@@ -1476,7 +1476,7 @@
           <w:sz w:val="22"/>
           <w:szCs w:val="22"/>
         </w:rPr>
-        <w:t xml:space="preserve">Le sang doit couler vers le bas — pas resté dans la viande. Le rite islamique exige une saignée complète. Mais le Coran rappelle (Hajj 22:37) que ce n'est PAS le sang qui compte aux yeux d'Allâh. C'est l'intention de celui qui donne.</w:t>
+        <w:t xml:space="preserve">Le sang doit couler vers le bas — pas resté dans la viande. Le rite islamique exige la coupe des vaisseaux du cou (dhabh) pour évacuer le sang. Mais le Coran rappelle (Hajj 22:37) que ce n'est PAS le sang qui compte aux yeux d'Allâh. C'est l'intention de celui qui donne.</w:t>
       </w:r>
     </w:p>
     <w:p>
@@ -6211,7 +6211,7 @@
           <w:sz w:val="22"/>
           <w:szCs w:val="22"/>
         </w:rPr>
-        <w:t xml:space="preserve">Personne ne sait quelle nuit exacte est Lailat al-Qadr. Le Prophète ﷺ a dit : 'Cherchez-la dans les nuits impaires des dix derniers jours.' (Bukhari). C'est volontaire — Allâh veut que tu pries chaque nuit pour ne pas la manquer.</w:t>
+        <w:t xml:space="preserve">Personne ne sait quelle nuit exacte est Lailat al-Qadr. Le Prophète ﷺ a dit : 'Cherchez-la dans les nuits impaires des dix derniers jours.' (Bukhari). C'est volontaire — Les savants y voient une sagesse : multiplier les actes d'adoration sur plusieurs nuits.</w:t>
       </w:r>
     </w:p>
     <w:p>

</xml_diff>